<commit_message>
Correct paper claims and verify saved analysis and review gates
</commit_message>
<xml_diff>
--- a/docs/NSL23_Paper_Explained.docx
+++ b/docs/NSL23_Paper_Explained.docx
@@ -349,7 +349,7 @@
           <w:color w:val="0B2545"/>
           <w:sz w:val="22"/>
         </w:rPr>
-        <w:t>Version 1 is reproducible and submission-ready as an exploratory study.</w:t>
+        <w:t>Version 1 has audited results and remains an exploratory study.</w:t>
         <w:br/>
         <w:t>Version 2 is protocol-ready but must not be trained until independent human review is complete.</w:t>
       </w:r>
@@ -3014,7 +3014,7 @@
           <w:rFonts w:ascii="Calibri" w:hAnsi="Calibri" w:eastAsia="Calibri"/>
           <w:i w:val="0"/>
         </w:rPr>
-        <w:t>Before the first full primary run, the project recorded SHA-256 hashes and byte sizes for 15 protocol, configuration, manifest, loader, model, training, and launcher files. The snapshot did not store a Git revision, so the audit searched history and found one exact tree: commit 0eb1ff20337b584a5a7e4b06d5e4d5a350915fc7. All 15 inputs match it byte-for-byte. The human-readable tag v1-protocol-freeze is a convenience pointer; the dated snapshot remains the chronology record.</w:t>
+        <w:t>Before the first full primary run, the project recorded SHA-256 hashes and byte sizes for 15 protocol, configuration, manifest, loader, model, training, and launcher files. The snapshot did not store a Git revision, so the audit searched history and found one exact tree: commit 0eb1ff20337b584a5a7e4b06d5e4d5a350915fc7. All 15 inputs match it byte-for-byte. The human-readable tag v1-protocol-freeze is a convenience pointer; the dated snapshot remains the chronology record. A one-epoch smoke test had already accessed S1 before the snapshot. The later tag is not preregistration.</w:t>
       </w:r>
     </w:p>
     <w:p>
@@ -3479,7 +3479,7 @@
                 <w:color w:val="0B2545"/>
                 <w:sz w:val="17"/>
               </w:rPr>
-              <w:t>Adds flexion/abduction geometry with rotation/scale robustness</w:t>
+              <w:t>Adds finger geometry; only the angle component has rigid-transform invariance</w:t>
             </w:r>
           </w:p>
         </w:tc>
@@ -3645,7 +3645,7 @@
                 <w:color w:val="0B2545"/>
                 <w:sz w:val="21"/>
               </w:rPr>
-              <w:t>pᵢ = lᵢ − l₀     ·     s = ‖p₉(x,y)‖₂     ·     p̃ᵢ = pᵢ / max(s, 10⁻⁶)</w:t>
+              <w:t>pᵢ = lᵢ − l₀     ·     s = ‖p₉(x,y)‖₂     ·     p̃ᵢ = pᵢ / s*</w:t>
             </w:r>
           </w:p>
           <w:p>
@@ -3660,7 +3660,7 @@
                 <w:color w:val="5D6875"/>
                 <w:sz w:val="18"/>
               </w:rPr>
-              <w:t>lᵢ is the detector coordinate; p̃ᵢ is the normalized coordinate used by the model.</w:t>
+              <w:t>The code uses s* = s when s ≥ 10⁻⁶, and s* = 1 otherwise. This avoids division by a nearly zero distance.</w:t>
             </w:r>
           </w:p>
         </w:tc>
@@ -3680,7 +3680,7 @@
           <w:rFonts w:ascii="Calibri" w:hAnsi="Calibri" w:eastAsia="Calibri"/>
           <w:i w:val="0"/>
         </w:rPr>
-        <w:t>The 63 normalized coordinates are concatenated with a detection flag. If MediaPipe misses a frame, that frame becomes zeros and the flag is 0. In the 6,000 cached primary frames, detection succeeded on 5,868 (97.8%), and no clip had zero detected frames.</w:t>
+        <w:t>The 63 normalized coordinates are concatenated with a detection flag. If MediaPipe misses a frame, that frame becomes zeros and the flag is 0. In the 6,000 cached primary frames, detection succeeded on 5,868 (97.8%), and no clip had zero detected frames. These are availability counts, not a measurement of landmark accuracy.</w:t>
       </w:r>
     </w:p>
     <w:p>
@@ -3830,7 +3830,7 @@
                 <w:color w:val="0B2545"/>
                 <w:sz w:val="21"/>
               </w:rPr>
-              <w:t>Two people can place their hands in different locations and orientations while bending the same finger joints. Angles explicitly encode that bending pattern. They are not magic: detector errors and visually similar classes still matter.</w:t>
+              <w:t>Two people can place their hands in different locations and orientations while bending the same finger joints. Angles explicitly encode that bending pattern. They are not magic: detector errors and visually similar classes still matter. Angles are unchanged by applying the same rigid rotation and uniform scale to valid points, but image-derived landmarks need not transform that way when the camera viewpoint changes. The concatenated xyz component still retains hand orientation.</w:t>
             </w:r>
           </w:p>
         </w:tc>
@@ -4789,7 +4789,7 @@
           <w:rFonts w:ascii="Calibri" w:hAnsi="Calibri" w:eastAsia="Calibri"/>
           <w:i w:val="0"/>
         </w:rPr>
-        <w:t>The Transformer projects each frame feature to 256 values, adds a learned time position, and uses four attention heads in two layers. Each attention head measures which time points should influence one another. With only 277 training clips per fold, the larger head can memorize signer-specific appearance without learning a portable hand representation.</w:t>
+        <w:t>The Transformer projects each frame feature to 256 values, adds a learned time position, and uses four attention heads in two layers. Each attention head measures which time points should influence one another. With only 277 training clips per fold, a large head can fit the training sample without transferring well to another signer. The scores do not identify which visual cues it learned.</w:t>
       </w:r>
     </w:p>
     <w:p>
@@ -4911,7 +4911,7 @@
         <w:rPr>
           <w:rFonts w:ascii="Calibri" w:hAnsi="Calibri" w:eastAsia="Calibri"/>
         </w:rPr>
-        <w:t>Five support and two query examples are sampled with replacement when a training class has fewer than seven clips.</w:t>
+        <w:t>When a class has fewer than seven clips, the five support and two query draws use replacement. A training clip can appear on both sides of an episode; the counts are draws, not distinct recordings.</w:t>
       </w:r>
     </w:p>
     <w:p>
@@ -5018,7 +5018,7 @@
                 <w:color w:val="5D6875"/>
                 <w:sz w:val="18"/>
               </w:rPr>
-              <w:t>nᶜ is the training count for class c.</w:t>
+              <w:t>nᶜ is the training count for class c. This is one example's loss; the batch mean divides summed losses by the sum of target-class weights.</w:t>
             </w:r>
           </w:p>
         </w:tc>
@@ -5311,6 +5311,181 @@
                 <w:sz w:val="17"/>
               </w:rPr>
               <w:t>3×10⁻⁴ / 10⁻⁴</w:t>
+            </w:r>
+          </w:p>
+        </w:tc>
+      </w:tr>
+      <w:tr>
+        <w:trPr>
+          <w:cantSplit/>
+        </w:trPr>
+        <w:tc>
+          <w:tcPr>
+            <w:tcW w:type="dxa" w:w="2600"/>
+            <w:tcMar>
+              <w:top w:w="80" w:type="dxa"/>
+              <w:start w:w="120" w:type="dxa"/>
+              <w:bottom w:w="80" w:type="dxa"/>
+              <w:end w:w="120" w:type="dxa"/>
+            </w:tcMar>
+            <w:vAlign w:val="center"/>
+          </w:tcPr>
+          <w:p>
+            <w:pPr>
+              <w:spacing w:before="20" w:after="20" w:line="252" w:lineRule="auto"/>
+              <w:jc w:val="left"/>
+            </w:pPr>
+            <w:r>
+              <w:rPr>
+                <w:rFonts w:ascii="Calibri" w:hAnsi="Calibri" w:eastAsia="Calibri"/>
+                <w:b/>
+                <w:color w:val="0B2545"/>
+                <w:sz w:val="17"/>
+              </w:rPr>
+              <w:t>Learning-rate schedule</w:t>
+            </w:r>
+          </w:p>
+        </w:tc>
+        <w:tc>
+          <w:tcPr>
+            <w:tcW w:type="dxa" w:w="3380"/>
+            <w:tcMar>
+              <w:top w:w="80" w:type="dxa"/>
+              <w:start w:w="120" w:type="dxa"/>
+              <w:bottom w:w="80" w:type="dxa"/>
+              <w:end w:w="120" w:type="dxa"/>
+            </w:tcMar>
+            <w:vAlign w:val="center"/>
+          </w:tcPr>
+          <w:p>
+            <w:pPr>
+              <w:spacing w:before="20" w:after="20" w:line="252" w:lineRule="auto"/>
+              <w:jc w:val="left"/>
+            </w:pPr>
+            <w:r>
+              <w:rPr>
+                <w:rFonts w:ascii="Calibri" w:hAnsi="Calibri" w:eastAsia="Calibri"/>
+                <w:b w:val="0"/>
+                <w:color w:val="0B2545"/>
+                <w:sz w:val="17"/>
+              </w:rPr>
+              <w:t>Cosine decay</w:t>
+            </w:r>
+          </w:p>
+        </w:tc>
+        <w:tc>
+          <w:tcPr>
+            <w:tcW w:type="dxa" w:w="3380"/>
+            <w:tcMar>
+              <w:top w:w="80" w:type="dxa"/>
+              <w:start w:w="120" w:type="dxa"/>
+              <w:bottom w:w="80" w:type="dxa"/>
+              <w:end w:w="120" w:type="dxa"/>
+            </w:tcMar>
+            <w:vAlign w:val="center"/>
+          </w:tcPr>
+          <w:p>
+            <w:pPr>
+              <w:spacing w:before="20" w:after="20" w:line="252" w:lineRule="auto"/>
+              <w:jc w:val="left"/>
+            </w:pPr>
+            <w:r>
+              <w:rPr>
+                <w:rFonts w:ascii="Calibri" w:hAnsi="Calibri" w:eastAsia="Calibri"/>
+                <w:b w:val="0"/>
+                <w:color w:val="0B2545"/>
+                <w:sz w:val="17"/>
+              </w:rPr>
+              <w:t>Constant</w:t>
+            </w:r>
+          </w:p>
+        </w:tc>
+      </w:tr>
+      <w:tr>
+        <w:trPr>
+          <w:cantSplit/>
+        </w:trPr>
+        <w:tc>
+          <w:tcPr>
+            <w:tcW w:type="dxa" w:w="2600"/>
+            <w:shd w:fill="FAFBFC"/>
+            <w:tcMar>
+              <w:top w:w="80" w:type="dxa"/>
+              <w:start w:w="120" w:type="dxa"/>
+              <w:bottom w:w="80" w:type="dxa"/>
+              <w:end w:w="120" w:type="dxa"/>
+            </w:tcMar>
+            <w:vAlign w:val="center"/>
+          </w:tcPr>
+          <w:p>
+            <w:pPr>
+              <w:spacing w:before="20" w:after="20" w:line="252" w:lineRule="auto"/>
+              <w:jc w:val="left"/>
+            </w:pPr>
+            <w:r>
+              <w:rPr>
+                <w:rFonts w:ascii="Calibri" w:hAnsi="Calibri" w:eastAsia="Calibri"/>
+                <w:b/>
+                <w:color w:val="0B2545"/>
+                <w:sz w:val="17"/>
+              </w:rPr>
+              <w:t>Landmark feature jitter</w:t>
+            </w:r>
+          </w:p>
+        </w:tc>
+        <w:tc>
+          <w:tcPr>
+            <w:tcW w:type="dxa" w:w="3380"/>
+            <w:shd w:fill="FAFBFC"/>
+            <w:tcMar>
+              <w:top w:w="80" w:type="dxa"/>
+              <w:start w:w="120" w:type="dxa"/>
+              <w:bottom w:w="80" w:type="dxa"/>
+              <w:end w:w="120" w:type="dxa"/>
+            </w:tcMar>
+            <w:vAlign w:val="center"/>
+          </w:tcPr>
+          <w:p>
+            <w:pPr>
+              <w:spacing w:before="20" w:after="20" w:line="252" w:lineRule="auto"/>
+              <w:jc w:val="left"/>
+            </w:pPr>
+            <w:r>
+              <w:rPr>
+                <w:rFonts w:ascii="Calibri" w:hAnsi="Calibri" w:eastAsia="Calibri"/>
+                <w:b w:val="0"/>
+                <w:color w:val="0B2545"/>
+                <w:sz w:val="17"/>
+              </w:rPr>
+              <w:t>Gaussian SD 0.02; flag unchanged</w:t>
+            </w:r>
+          </w:p>
+        </w:tc>
+        <w:tc>
+          <w:tcPr>
+            <w:tcW w:type="dxa" w:w="3380"/>
+            <w:shd w:fill="FAFBFC"/>
+            <w:tcMar>
+              <w:top w:w="80" w:type="dxa"/>
+              <w:start w:w="120" w:type="dxa"/>
+              <w:bottom w:w="80" w:type="dxa"/>
+              <w:end w:w="120" w:type="dxa"/>
+            </w:tcMar>
+            <w:vAlign w:val="center"/>
+          </w:tcPr>
+          <w:p>
+            <w:pPr>
+              <w:spacing w:before="20" w:after="20" w:line="252" w:lineRule="auto"/>
+              <w:jc w:val="left"/>
+            </w:pPr>
+            <w:r>
+              <w:rPr>
+                <w:rFonts w:ascii="Calibri" w:hAnsi="Calibri" w:eastAsia="Calibri"/>
+                <w:b w:val="0"/>
+                <w:color w:val="0B2545"/>
+                <w:sz w:val="17"/>
+              </w:rPr>
+              <w:t>None</w:t>
             </w:r>
           </w:p>
         </w:tc>
@@ -5832,7 +6007,7 @@
                 <w:color w:val="0B2545"/>
                 <w:sz w:val="21"/>
               </w:rPr>
-              <w:t>The audit recomputed paper values from 196 per-seed predictions, checked checkpoint and metrics inventories, verified frozen inputs, and regenerated figures/tables. Retraining would answer a different question about cross-hardware repeatability and would take hours.</w:t>
+              <w:t>The audit recomputed paper values from 196 per-seed predictions, checked checkpoint and metrics inventories, verified frozen inputs, and regenerated figures/tables. The October scan also loaded all 60 checkpoints, replayed all landmark evaluation clips and representative RGB clips, and recomputed the separate closed-enrollment results. Retraining would answer a different question about cross-hardware repeatability and would take hours.</w:t>
             </w:r>
           </w:p>
         </w:tc>
@@ -6958,7 +7133,7 @@
         <w:pStyle w:val="Heading1"/>
       </w:pPr>
       <w:r>
-        <w:t>8. Results: what improved, and why</w:t>
+        <w:t>8. Results: what improved, and what we can infer</w:t>
       </w:r>
     </w:p>
     <w:p>
@@ -7217,7 +7392,7 @@
                 <w:color w:val="0B2545"/>
                 <w:sz w:val="17"/>
               </w:rPr>
-              <w:t>Frozen full-frame RGB is near the bottom of the useful range</w:t>
+              <w:t>Most evaluation clips are classified incorrectly</w:t>
             </w:r>
           </w:p>
         </w:tc>
@@ -7447,7 +7622,7 @@
                 <w:color w:val="0B2545"/>
                 <w:sz w:val="17"/>
               </w:rPr>
-              <w:t>More attention capacity does not solve representation mismatch</w:t>
+              <w:t>The observed gain over the single-frame model is small</w:t>
             </w:r>
           </w:p>
         </w:tc>
@@ -7564,7 +7739,7 @@
                 <w:color w:val="0B2545"/>
                 <w:sz w:val="17"/>
               </w:rPr>
-              <w:t>Removing appearance/background is a large gain</w:t>
+              <w:t>Landmark features outperform the frozen RGB baselines</w:t>
             </w:r>
           </w:p>
         </w:tc>
@@ -7757,7 +7932,7 @@
           <w:rFonts w:ascii="Calibri" w:hAnsi="Calibri" w:eastAsia="Calibri"/>
           <w:i w:val="0"/>
         </w:rPr>
-        <w:t>The CNN–BiLSTM and CNN–Transformer reach mean training accuracy 1.00 by the final epoch, while test accuracy remains around 6–7%. This is a classic generalization gap: the heads have enough capacity to memorize the six training people and their recording appearance, but the frozen visual features do not organize an unseen signer’s hand shapes in the same way.</w:t>
+        <w:t>The CNN–BiLSTM and CNN–Transformer reach mean training accuracy 1.00 by the final epoch, while test accuracy remains around 6–7%. This is a generalization gap: fitting the training clips did not produce reliable classification on these two unseen signers. Background, hand resolution, and feature mismatch are possible explanations, but the experiment does not isolate their effects.</w:t>
       </w:r>
     </w:p>
     <w:p>
@@ -7766,7 +7941,6 @@
         <w:jc w:val="center"/>
         <w:keepNext/>
         <w:keepLines/>
-        <w:pageBreakBefore/>
       </w:pPr>
       <w:r>
         <w:drawing>
@@ -8839,7 +9013,7 @@
           <w:rFonts w:ascii="Calibri" w:hAnsi="Calibri" w:eastAsia="Calibri"/>
           <w:i w:val="0"/>
         </w:rPr>
-        <w:t>The important scientific pattern is not just a taller final bar. Angles lift consonants from 10.0% to 28.7% under cross entropy. Prototypical training then changes the class geometry enough to reach 61.8% consonant accuracy. Vowel accuracy falls from the softmax model’s 66.0% to 52.6%, so the final gain is a more balanced alphabet representation rather than simply becoming an even stronger vowel classifier.</w:t>
+        <w:t>The important scientific pattern is not just a taller final bar. Angles lift consonants from 10.0% to 28.7% under cross entropy. The xyz+angle prototypical model reaches 61.8% consonant accuracy, although its loss, episode sampling, and epoch count all differ from the softmax model. Vowel accuracy falls from 66.0% to 52.6%, so the final gain is a more balanced alphabet representation rather than simply becoming an even stronger vowel classifier.</w:t>
       </w:r>
     </w:p>
     <w:tbl>
@@ -9482,7 +9656,7 @@
         <w:drawing>
           <wp:inline xmlns:a="http://schemas.openxmlformats.org/drawingml/2006/main" xmlns:pic="http://schemas.openxmlformats.org/drawingml/2006/picture">
             <wp:extent cx="5715000" cy="2537803"/>
-            <wp:docPr id="9" name="Picture 9" title="Figure 9" descr="Protocol ladder comparing 49-way unseen top-1, top-3, top-5, 36-way consonants, and 5-way one-shot exams against their different chance baselines."/>
+            <wp:docPr id="9" name="Picture 9" title="Figure 9" descr="Comparison of 49-way scores, 36-way consonants, a five-class restriction using full training means, and same-signer one-shot enrollment."/>
             <wp:cNvGraphicFramePr>
               <a:graphicFrameLocks noChangeAspect="1"/>
             </wp:cNvGraphicFramePr>
@@ -9595,7 +9769,7 @@
         <w:rPr>
           <w:rFonts w:ascii="Calibri" w:hAnsi="Calibri" w:eastAsia="Calibri"/>
         </w:rPr>
-        <w:t>5-way 1-shot with unseen-signer training prototypes: 90.6% ± 2.5%; chance 20.0%.</w:t>
+        <w:t>5-way restriction with full training-class means: 90.6% ± 2.5%; chance 20.0%. Each mean uses all training clips of that class, so this is not one-shot.</w:t>
       </w:r>
     </w:p>
     <w:tbl>
@@ -9653,7 +9827,7 @@
                 <w:color w:val="0B2545"/>
                 <w:sz w:val="21"/>
               </w:rPr>
-              <w:t>Never shorten ‘90.6% on 5-way 1-shot episodes’ to ‘90.6% NSL23 alphabet accuracy.’ That changes both the number of competing classes and the support information available to the model.</w:t>
+              <w:t>Never shorten ‘90.6% with five candidate classes’ to ‘90.6% NSL23 alphabet accuracy.’ That changes both the number of competing classes and the support information available to the model.</w:t>
             </w:r>
           </w:p>
         </w:tc>
@@ -10939,7 +11113,7 @@
                 <w:color w:val="0B2545"/>
                 <w:sz w:val="17"/>
               </w:rPr>
-              <w:t>That is a 5-way few-shot exam with 20% chance.</w:t>
+              <w:t>That is a five-class restriction with full training means and 20% chance.</w:t>
             </w:r>
           </w:p>
         </w:tc>
@@ -13324,7 +13498,7 @@
         <w:rPr>
           <w:rFonts w:ascii="Calibri" w:hAnsi="Calibri" w:eastAsia="Calibri"/>
         </w:rPr>
-        <w:t>Stage 3 selection: if S3 is complete, run exactly three preregistered geometry trials with development leave-one-signer-out mean top-1. If S3 is incomplete, skip the search and carry the Stage 2 specification.</w:t>
+        <w:t>Stage 3 selection: if S3 is complete, run exactly three preregistered geometry trials, selecting mean per-signer macro-recall across development LOSO folds and seeds. If S3 is incomplete, skip the search and carry the Stage 2 specification.</w:t>
       </w:r>
     </w:p>
     <w:p>
@@ -14143,7 +14317,7 @@
           <w:rFonts w:ascii="Calibri" w:hAnsi="Calibri" w:eastAsia="Calibri"/>
           <w:i w:val="0"/>
         </w:rPr>
-        <w:t>The strict verifier checks the 630-row manifest, 375 primary clips, fold sizes, test identities, class coverage, source existence, RGB caches, and the historical freeze. The numerical audit reads stored predictions and verifies the central manuscript tables. The claim validator links primitive outputs to compiled PDF text.</w:t>
+        <w:t>The strict verifier checks the 630-row manifest, 375 primary clips, fold sizes, test identities, class coverage, source existence, RGB caches, and the historical freeze. The numerical audit reads stored predictions and verifies the central manuscript tables. The claim validator checks several primary artifacts and that a compiled PDF exists; PDF text and page layout are checked separately.</w:t>
       </w:r>
     </w:p>
     <w:p>
@@ -14383,7 +14557,7 @@
                 <w:color w:val="0B2545"/>
                 <w:sz w:val="17"/>
               </w:rPr>
-              <w:t>docs/FULL_AUDIT_2026-08-23.md</w:t>
+              <w:t>docs/FINAL_SCAN_2026-10-11.md</w:t>
             </w:r>
           </w:p>
         </w:tc>
@@ -14410,7 +14584,7 @@
                 <w:color w:val="0B2545"/>
                 <w:sz w:val="17"/>
               </w:rPr>
-              <w:t>Independent repository, numerical, chronology, and readiness audit</w:t>
+              <w:t>Latest corrections, checkpoint replay, source checks, and verification limits</w:t>
             </w:r>
           </w:p>
         </w:tc>
@@ -16713,7 +16887,7 @@
                 <w:color w:val="0B2545"/>
                 <w:sz w:val="21"/>
               </w:rPr>
-              <w:t>Full-frame RGB mostly failed across people. Wrist-relative landmarks removed visual nuisance; joint angles described finger geometry.</w:t>
+              <w:t>Full-frame RGB scored poorly on these two signers. Wrist-relative landmarks removed direct background pixels; joint angles added finger geometry.</w:t>
             </w:r>
           </w:p>
         </w:tc>
@@ -16939,7 +17113,7 @@
           <w:rFonts w:ascii="Calibri" w:hAnsi="Calibri" w:eastAsia="Calibri"/>
           <w:i w:val="0"/>
         </w:rPr>
-        <w:t>This guide was generated from the audited repository state on 23 August 2026. Numerical anchors trace to artifacts/results, artifacts/audit/full_paper_audit.json, and the manuscript. Operational Version 2 details trace to PAPER_DIRECTION.md, VERSION2.md, configs/v2_protocol.json, and annotations/v2. For formal citations to NSL23, MediaPipe, MobileNetV2, LSTM, Transformer, prototypical networks, metrics, and related NSL work, use the bibliography in manuscript/nsl23_low_resource.pdf.</w:t>
+        <w:t>This guide was updated after the repository scan on 11 October 2026. Numerical anchors trace to artifacts/results, artifacts/audit/full_paper_audit.json, and the manuscript. Operational Version 2 details trace to PAPER_DIRECTION.md, VERSION2.md, configs/v2_protocol.json, and annotations/v2. For formal citations to NSL23, MediaPipe, MobileNetV2, LSTM, Transformer, prototypical networks, metrics, and related NSL work, use the bibliography in manuscript/nsl23_low_resource.pdf.</w:t>
       </w:r>
     </w:p>
     <w:sectPr>
@@ -17023,7 +17197,7 @@
         <w:color w:val="5D6875"/>
         <w:sz w:val="17"/>
       </w:rPr>
-      <w:t>Prepared from the audited repository state · 23 August 2026</w:t>
+      <w:t>Updated after the final repository scan · 11 October 2026</w:t>
     </w:r>
   </w:p>
 </w:ftr>

</xml_diff>